<commit_message>
Audit trail: admins only
The treasurer and the secretary no longer read or export the audit trail. The API
answers 403, the menu entry is gone for both, and the route guard sends them home.
Docs, the Word guide and its PDF follow.

Co-Authored-By: Claude Sonnet 5.5 <noreply@anthropic.com>
</commit_message>
<xml_diff>
--- a/USER_INTERACTION_GUIDE.docx
+++ b/USER_INTERACTION_GUIDE.docx
@@ -285,7 +285,7 @@
       <w:pPr>
         <w:pStyle w:val="Heading1"/>
       </w:pPr>
-      <w:bookmarkStart w:id="0" w:name="_Toc243120002"/>
+      <w:bookmarkStart w:id="0" w:name="_Toc243135911"/>
       <w:r>
         <w:lastRenderedPageBreak/>
         <w:t>Contents</w:t>
@@ -311,7 +311,7 @@
       <w:r>
         <w:fldChar w:fldCharType="separate"/>
       </w:r>
-      <w:hyperlink w:anchor="_Toc243120002" w:history="1">
+      <w:hyperlink w:anchor="_Toc243135911" w:history="1">
         <w:r>
           <w:rPr>
             <w:rStyle w:val="Hyperlink"/>
@@ -338,7 +338,7 @@
             <w:noProof/>
             <w:webHidden/>
           </w:rPr>
-          <w:instrText xml:space="preserve"> PAGEREF _Toc243120002 \h </w:instrText>
+          <w:instrText xml:space="preserve"> PAGEREF _Toc243135911 \h </w:instrText>
         </w:r>
         <w:r>
           <w:rPr>
@@ -379,7 +379,7 @@
           <w:noProof/>
         </w:rPr>
       </w:pPr>
-      <w:hyperlink w:anchor="_Toc243120003" w:history="1">
+      <w:hyperlink w:anchor="_Toc243135912" w:history="1">
         <w:r>
           <w:rPr>
             <w:rStyle w:val="Hyperlink"/>
@@ -406,7 +406,7 @@
             <w:noProof/>
             <w:webHidden/>
           </w:rPr>
-          <w:instrText xml:space="preserve"> PAGEREF _Toc243120003 \h </w:instrText>
+          <w:instrText xml:space="preserve"> PAGEREF _Toc243135912 \h </w:instrText>
         </w:r>
         <w:r>
           <w:rPr>
@@ -447,7 +447,7 @@
           <w:noProof/>
         </w:rPr>
       </w:pPr>
-      <w:hyperlink w:anchor="_Toc243120004" w:history="1">
+      <w:hyperlink w:anchor="_Toc243135913" w:history="1">
         <w:r>
           <w:rPr>
             <w:rStyle w:val="Hyperlink"/>
@@ -474,7 +474,7 @@
             <w:noProof/>
             <w:webHidden/>
           </w:rPr>
-          <w:instrText xml:space="preserve"> PAGEREF _Toc243120004 \h </w:instrText>
+          <w:instrText xml:space="preserve"> PAGEREF _Toc243135913 \h </w:instrText>
         </w:r>
         <w:r>
           <w:rPr>
@@ -515,7 +515,7 @@
           <w:noProof/>
         </w:rPr>
       </w:pPr>
-      <w:hyperlink w:anchor="_Toc243120005" w:history="1">
+      <w:hyperlink w:anchor="_Toc243135914" w:history="1">
         <w:r>
           <w:rPr>
             <w:rStyle w:val="Hyperlink"/>
@@ -542,7 +542,7 @@
             <w:noProof/>
             <w:webHidden/>
           </w:rPr>
-          <w:instrText xml:space="preserve"> PAGEREF _Toc243120005 \h </w:instrText>
+          <w:instrText xml:space="preserve"> PAGEREF _Toc243135914 \h </w:instrText>
         </w:r>
         <w:r>
           <w:rPr>
@@ -583,7 +583,7 @@
           <w:noProof/>
         </w:rPr>
       </w:pPr>
-      <w:hyperlink w:anchor="_Toc243120006" w:history="1">
+      <w:hyperlink w:anchor="_Toc243135915" w:history="1">
         <w:r>
           <w:rPr>
             <w:rStyle w:val="Hyperlink"/>
@@ -610,7 +610,7 @@
             <w:noProof/>
             <w:webHidden/>
           </w:rPr>
-          <w:instrText xml:space="preserve"> PAGEREF _Toc243120006 \h </w:instrText>
+          <w:instrText xml:space="preserve"> PAGEREF _Toc243135915 \h </w:instrText>
         </w:r>
         <w:r>
           <w:rPr>
@@ -651,7 +651,7 @@
           <w:noProof/>
         </w:rPr>
       </w:pPr>
-      <w:hyperlink w:anchor="_Toc243120007" w:history="1">
+      <w:hyperlink w:anchor="_Toc243135916" w:history="1">
         <w:r>
           <w:rPr>
             <w:rStyle w:val="Hyperlink"/>
@@ -678,7 +678,7 @@
             <w:noProof/>
             <w:webHidden/>
           </w:rPr>
-          <w:instrText xml:space="preserve"> PAGEREF _Toc243120007 \h </w:instrText>
+          <w:instrText xml:space="preserve"> PAGEREF _Toc243135916 \h </w:instrText>
         </w:r>
         <w:r>
           <w:rPr>
@@ -719,7 +719,7 @@
           <w:noProof/>
         </w:rPr>
       </w:pPr>
-      <w:hyperlink w:anchor="_Toc243120008" w:history="1">
+      <w:hyperlink w:anchor="_Toc243135917" w:history="1">
         <w:r>
           <w:rPr>
             <w:rStyle w:val="Hyperlink"/>
@@ -746,7 +746,7 @@
             <w:noProof/>
             <w:webHidden/>
           </w:rPr>
-          <w:instrText xml:space="preserve"> PAGEREF _Toc243120008 \h </w:instrText>
+          <w:instrText xml:space="preserve"> PAGEREF _Toc243135917 \h </w:instrText>
         </w:r>
         <w:r>
           <w:rPr>
@@ -787,7 +787,7 @@
           <w:noProof/>
         </w:rPr>
       </w:pPr>
-      <w:hyperlink w:anchor="_Toc243120009" w:history="1">
+      <w:hyperlink w:anchor="_Toc243135918" w:history="1">
         <w:r>
           <w:rPr>
             <w:rStyle w:val="Hyperlink"/>
@@ -814,7 +814,7 @@
             <w:noProof/>
             <w:webHidden/>
           </w:rPr>
-          <w:instrText xml:space="preserve"> PAGEREF _Toc243120009 \h </w:instrText>
+          <w:instrText xml:space="preserve"> PAGEREF _Toc243135918 \h </w:instrText>
         </w:r>
         <w:r>
           <w:rPr>
@@ -855,7 +855,7 @@
           <w:noProof/>
         </w:rPr>
       </w:pPr>
-      <w:hyperlink w:anchor="_Toc243120010" w:history="1">
+      <w:hyperlink w:anchor="_Toc243135919" w:history="1">
         <w:r>
           <w:rPr>
             <w:rStyle w:val="Hyperlink"/>
@@ -882,7 +882,7 @@
             <w:noProof/>
             <w:webHidden/>
           </w:rPr>
-          <w:instrText xml:space="preserve"> PAGEREF _Toc243120010 \h </w:instrText>
+          <w:instrText xml:space="preserve"> PAGEREF _Toc243135919 \h </w:instrText>
         </w:r>
         <w:r>
           <w:rPr>
@@ -923,7 +923,7 @@
           <w:noProof/>
         </w:rPr>
       </w:pPr>
-      <w:hyperlink w:anchor="_Toc243120011" w:history="1">
+      <w:hyperlink w:anchor="_Toc243135920" w:history="1">
         <w:r>
           <w:rPr>
             <w:rStyle w:val="Hyperlink"/>
@@ -950,7 +950,7 @@
             <w:noProof/>
             <w:webHidden/>
           </w:rPr>
-          <w:instrText xml:space="preserve"> PAGEREF _Toc243120011 \h </w:instrText>
+          <w:instrText xml:space="preserve"> PAGEREF _Toc243135920 \h </w:instrText>
         </w:r>
         <w:r>
           <w:rPr>
@@ -991,7 +991,7 @@
           <w:noProof/>
         </w:rPr>
       </w:pPr>
-      <w:hyperlink w:anchor="_Toc243120012" w:history="1">
+      <w:hyperlink w:anchor="_Toc243135921" w:history="1">
         <w:r>
           <w:rPr>
             <w:rStyle w:val="Hyperlink"/>
@@ -1018,7 +1018,7 @@
             <w:noProof/>
             <w:webHidden/>
           </w:rPr>
-          <w:instrText xml:space="preserve"> PAGEREF _Toc243120012 \h </w:instrText>
+          <w:instrText xml:space="preserve"> PAGEREF _Toc243135921 \h </w:instrText>
         </w:r>
         <w:r>
           <w:rPr>
@@ -1059,7 +1059,7 @@
           <w:noProof/>
         </w:rPr>
       </w:pPr>
-      <w:hyperlink w:anchor="_Toc243120013" w:history="1">
+      <w:hyperlink w:anchor="_Toc243135922" w:history="1">
         <w:r>
           <w:rPr>
             <w:rStyle w:val="Hyperlink"/>
@@ -1086,7 +1086,7 @@
             <w:noProof/>
             <w:webHidden/>
           </w:rPr>
-          <w:instrText xml:space="preserve"> PAGEREF _Toc243120013 \h </w:instrText>
+          <w:instrText xml:space="preserve"> PAGEREF _Toc243135922 \h </w:instrText>
         </w:r>
         <w:r>
           <w:rPr>
@@ -1127,7 +1127,7 @@
           <w:noProof/>
         </w:rPr>
       </w:pPr>
-      <w:hyperlink w:anchor="_Toc243120014" w:history="1">
+      <w:hyperlink w:anchor="_Toc243135923" w:history="1">
         <w:r>
           <w:rPr>
             <w:rStyle w:val="Hyperlink"/>
@@ -1154,7 +1154,7 @@
             <w:noProof/>
             <w:webHidden/>
           </w:rPr>
-          <w:instrText xml:space="preserve"> PAGEREF _Toc243120014 \h </w:instrText>
+          <w:instrText xml:space="preserve"> PAGEREF _Toc243135923 \h </w:instrText>
         </w:r>
         <w:r>
           <w:rPr>
@@ -1195,7 +1195,7 @@
           <w:noProof/>
         </w:rPr>
       </w:pPr>
-      <w:hyperlink w:anchor="_Toc243120015" w:history="1">
+      <w:hyperlink w:anchor="_Toc243135924" w:history="1">
         <w:r>
           <w:rPr>
             <w:rStyle w:val="Hyperlink"/>
@@ -1222,7 +1222,7 @@
             <w:noProof/>
             <w:webHidden/>
           </w:rPr>
-          <w:instrText xml:space="preserve"> PAGEREF _Toc243120015 \h </w:instrText>
+          <w:instrText xml:space="preserve"> PAGEREF _Toc243135924 \h </w:instrText>
         </w:r>
         <w:r>
           <w:rPr>
@@ -1263,7 +1263,7 @@
           <w:noProof/>
         </w:rPr>
       </w:pPr>
-      <w:hyperlink w:anchor="_Toc243120016" w:history="1">
+      <w:hyperlink w:anchor="_Toc243135925" w:history="1">
         <w:r>
           <w:rPr>
             <w:rStyle w:val="Hyperlink"/>
@@ -1290,7 +1290,7 @@
             <w:noProof/>
             <w:webHidden/>
           </w:rPr>
-          <w:instrText xml:space="preserve"> PAGEREF _Toc243120016 \h </w:instrText>
+          <w:instrText xml:space="preserve"> PAGEREF _Toc243135925 \h </w:instrText>
         </w:r>
         <w:r>
           <w:rPr>
@@ -1331,7 +1331,7 @@
           <w:noProof/>
         </w:rPr>
       </w:pPr>
-      <w:hyperlink w:anchor="_Toc243120017" w:history="1">
+      <w:hyperlink w:anchor="_Toc243135926" w:history="1">
         <w:r>
           <w:rPr>
             <w:rStyle w:val="Hyperlink"/>
@@ -1358,7 +1358,7 @@
             <w:noProof/>
             <w:webHidden/>
           </w:rPr>
-          <w:instrText xml:space="preserve"> PAGEREF _Toc243120017 \h </w:instrText>
+          <w:instrText xml:space="preserve"> PAGEREF _Toc243135926 \h </w:instrText>
         </w:r>
         <w:r>
           <w:rPr>
@@ -1399,7 +1399,7 @@
           <w:noProof/>
         </w:rPr>
       </w:pPr>
-      <w:hyperlink w:anchor="_Toc243120018" w:history="1">
+      <w:hyperlink w:anchor="_Toc243135927" w:history="1">
         <w:r>
           <w:rPr>
             <w:rStyle w:val="Hyperlink"/>
@@ -1426,7 +1426,7 @@
             <w:noProof/>
             <w:webHidden/>
           </w:rPr>
-          <w:instrText xml:space="preserve"> PAGEREF _Toc243120018 \h </w:instrText>
+          <w:instrText xml:space="preserve"> PAGEREF _Toc243135927 \h </w:instrText>
         </w:r>
         <w:r>
           <w:rPr>
@@ -1467,7 +1467,7 @@
           <w:noProof/>
         </w:rPr>
       </w:pPr>
-      <w:hyperlink w:anchor="_Toc243120019" w:history="1">
+      <w:hyperlink w:anchor="_Toc243135928" w:history="1">
         <w:r>
           <w:rPr>
             <w:rStyle w:val="Hyperlink"/>
@@ -1494,7 +1494,7 @@
             <w:noProof/>
             <w:webHidden/>
           </w:rPr>
-          <w:instrText xml:space="preserve"> PAGEREF _Toc243120019 \h </w:instrText>
+          <w:instrText xml:space="preserve"> PAGEREF _Toc243135928 \h </w:instrText>
         </w:r>
         <w:r>
           <w:rPr>
@@ -1535,7 +1535,7 @@
           <w:noProof/>
         </w:rPr>
       </w:pPr>
-      <w:hyperlink w:anchor="_Toc243120020" w:history="1">
+      <w:hyperlink w:anchor="_Toc243135929" w:history="1">
         <w:r>
           <w:rPr>
             <w:rStyle w:val="Hyperlink"/>
@@ -1562,7 +1562,7 @@
             <w:noProof/>
             <w:webHidden/>
           </w:rPr>
-          <w:instrText xml:space="preserve"> PAGEREF _Toc243120020 \h </w:instrText>
+          <w:instrText xml:space="preserve"> PAGEREF _Toc243135929 \h </w:instrText>
         </w:r>
         <w:r>
           <w:rPr>
@@ -1603,7 +1603,7 @@
           <w:noProof/>
         </w:rPr>
       </w:pPr>
-      <w:hyperlink w:anchor="_Toc243120021" w:history="1">
+      <w:hyperlink w:anchor="_Toc243135930" w:history="1">
         <w:r>
           <w:rPr>
             <w:rStyle w:val="Hyperlink"/>
@@ -1630,7 +1630,7 @@
             <w:noProof/>
             <w:webHidden/>
           </w:rPr>
-          <w:instrText xml:space="preserve"> PAGEREF _Toc243120021 \h </w:instrText>
+          <w:instrText xml:space="preserve"> PAGEREF _Toc243135930 \h </w:instrText>
         </w:r>
         <w:r>
           <w:rPr>
@@ -1671,7 +1671,7 @@
           <w:noProof/>
         </w:rPr>
       </w:pPr>
-      <w:hyperlink w:anchor="_Toc243120022" w:history="1">
+      <w:hyperlink w:anchor="_Toc243135931" w:history="1">
         <w:r>
           <w:rPr>
             <w:rStyle w:val="Hyperlink"/>
@@ -1698,7 +1698,7 @@
             <w:noProof/>
             <w:webHidden/>
           </w:rPr>
-          <w:instrText xml:space="preserve"> PAGEREF _Toc243120022 \h </w:instrText>
+          <w:instrText xml:space="preserve"> PAGEREF _Toc243135931 \h </w:instrText>
         </w:r>
         <w:r>
           <w:rPr>
@@ -1739,7 +1739,7 @@
           <w:noProof/>
         </w:rPr>
       </w:pPr>
-      <w:hyperlink w:anchor="_Toc243120023" w:history="1">
+      <w:hyperlink w:anchor="_Toc243135932" w:history="1">
         <w:r>
           <w:rPr>
             <w:rStyle w:val="Hyperlink"/>
@@ -1766,7 +1766,7 @@
             <w:noProof/>
             <w:webHidden/>
           </w:rPr>
-          <w:instrText xml:space="preserve"> PAGEREF _Toc243120023 \h </w:instrText>
+          <w:instrText xml:space="preserve"> PAGEREF _Toc243135932 \h </w:instrText>
         </w:r>
         <w:r>
           <w:rPr>
@@ -1807,7 +1807,7 @@
           <w:noProof/>
         </w:rPr>
       </w:pPr>
-      <w:hyperlink w:anchor="_Toc243120024" w:history="1">
+      <w:hyperlink w:anchor="_Toc243135933" w:history="1">
         <w:r>
           <w:rPr>
             <w:rStyle w:val="Hyperlink"/>
@@ -1834,7 +1834,7 @@
             <w:noProof/>
             <w:webHidden/>
           </w:rPr>
-          <w:instrText xml:space="preserve"> PAGEREF _Toc243120024 \h </w:instrText>
+          <w:instrText xml:space="preserve"> PAGEREF _Toc243135933 \h </w:instrText>
         </w:r>
         <w:r>
           <w:rPr>
@@ -1875,7 +1875,7 @@
           <w:noProof/>
         </w:rPr>
       </w:pPr>
-      <w:hyperlink w:anchor="_Toc243120025" w:history="1">
+      <w:hyperlink w:anchor="_Toc243135934" w:history="1">
         <w:r>
           <w:rPr>
             <w:rStyle w:val="Hyperlink"/>
@@ -1902,7 +1902,7 @@
             <w:noProof/>
             <w:webHidden/>
           </w:rPr>
-          <w:instrText xml:space="preserve"> PAGEREF _Toc243120025 \h </w:instrText>
+          <w:instrText xml:space="preserve"> PAGEREF _Toc243135934 \h </w:instrText>
         </w:r>
         <w:r>
           <w:rPr>
@@ -1943,7 +1943,7 @@
           <w:noProof/>
         </w:rPr>
       </w:pPr>
-      <w:hyperlink w:anchor="_Toc243120026" w:history="1">
+      <w:hyperlink w:anchor="_Toc243135935" w:history="1">
         <w:r>
           <w:rPr>
             <w:rStyle w:val="Hyperlink"/>
@@ -1970,7 +1970,7 @@
             <w:noProof/>
             <w:webHidden/>
           </w:rPr>
-          <w:instrText xml:space="preserve"> PAGEREF _Toc243120026 \h </w:instrText>
+          <w:instrText xml:space="preserve"> PAGEREF _Toc243135935 \h </w:instrText>
         </w:r>
         <w:r>
           <w:rPr>
@@ -2011,7 +2011,7 @@
           <w:noProof/>
         </w:rPr>
       </w:pPr>
-      <w:hyperlink w:anchor="_Toc243120027" w:history="1">
+      <w:hyperlink w:anchor="_Toc243135936" w:history="1">
         <w:r>
           <w:rPr>
             <w:rStyle w:val="Hyperlink"/>
@@ -2038,7 +2038,7 @@
             <w:noProof/>
             <w:webHidden/>
           </w:rPr>
-          <w:instrText xml:space="preserve"> PAGEREF _Toc243120027 \h </w:instrText>
+          <w:instrText xml:space="preserve"> PAGEREF _Toc243135936 \h </w:instrText>
         </w:r>
         <w:r>
           <w:rPr>
@@ -2079,7 +2079,7 @@
           <w:noProof/>
         </w:rPr>
       </w:pPr>
-      <w:hyperlink w:anchor="_Toc243120028" w:history="1">
+      <w:hyperlink w:anchor="_Toc243135937" w:history="1">
         <w:r>
           <w:rPr>
             <w:rStyle w:val="Hyperlink"/>
@@ -2106,7 +2106,7 @@
             <w:noProof/>
             <w:webHidden/>
           </w:rPr>
-          <w:instrText xml:space="preserve"> PAGEREF _Toc243120028 \h </w:instrText>
+          <w:instrText xml:space="preserve"> PAGEREF _Toc243135937 \h </w:instrText>
         </w:r>
         <w:r>
           <w:rPr>
@@ -2147,7 +2147,7 @@
           <w:noProof/>
         </w:rPr>
       </w:pPr>
-      <w:hyperlink w:anchor="_Toc243120029" w:history="1">
+      <w:hyperlink w:anchor="_Toc243135938" w:history="1">
         <w:r>
           <w:rPr>
             <w:rStyle w:val="Hyperlink"/>
@@ -2174,7 +2174,7 @@
             <w:noProof/>
             <w:webHidden/>
           </w:rPr>
-          <w:instrText xml:space="preserve"> PAGEREF _Toc243120029 \h </w:instrText>
+          <w:instrText xml:space="preserve"> PAGEREF _Toc243135938 \h </w:instrText>
         </w:r>
         <w:r>
           <w:rPr>
@@ -2215,7 +2215,7 @@
           <w:noProof/>
         </w:rPr>
       </w:pPr>
-      <w:hyperlink w:anchor="_Toc243120030" w:history="1">
+      <w:hyperlink w:anchor="_Toc243135939" w:history="1">
         <w:r>
           <w:rPr>
             <w:rStyle w:val="Hyperlink"/>
@@ -2242,7 +2242,7 @@
             <w:noProof/>
             <w:webHidden/>
           </w:rPr>
-          <w:instrText xml:space="preserve"> PAGEREF _Toc243120030 \h </w:instrText>
+          <w:instrText xml:space="preserve"> PAGEREF _Toc243135939 \h </w:instrText>
         </w:r>
         <w:r>
           <w:rPr>
@@ -2283,7 +2283,7 @@
           <w:noProof/>
         </w:rPr>
       </w:pPr>
-      <w:hyperlink w:anchor="_Toc243120031" w:history="1">
+      <w:hyperlink w:anchor="_Toc243135940" w:history="1">
         <w:r>
           <w:rPr>
             <w:rStyle w:val="Hyperlink"/>
@@ -2310,7 +2310,7 @@
             <w:noProof/>
             <w:webHidden/>
           </w:rPr>
-          <w:instrText xml:space="preserve"> PAGEREF _Toc243120031 \h </w:instrText>
+          <w:instrText xml:space="preserve"> PAGEREF _Toc243135940 \h </w:instrText>
         </w:r>
         <w:r>
           <w:rPr>
@@ -2351,7 +2351,7 @@
           <w:noProof/>
         </w:rPr>
       </w:pPr>
-      <w:hyperlink w:anchor="_Toc243120032" w:history="1">
+      <w:hyperlink w:anchor="_Toc243135941" w:history="1">
         <w:r>
           <w:rPr>
             <w:rStyle w:val="Hyperlink"/>
@@ -2378,7 +2378,7 @@
             <w:noProof/>
             <w:webHidden/>
           </w:rPr>
-          <w:instrText xml:space="preserve"> PAGEREF _Toc243120032 \h </w:instrText>
+          <w:instrText xml:space="preserve"> PAGEREF _Toc243135941 \h </w:instrText>
         </w:r>
         <w:r>
           <w:rPr>
@@ -2419,7 +2419,7 @@
           <w:noProof/>
         </w:rPr>
       </w:pPr>
-      <w:hyperlink w:anchor="_Toc243120033" w:history="1">
+      <w:hyperlink w:anchor="_Toc243135942" w:history="1">
         <w:r>
           <w:rPr>
             <w:rStyle w:val="Hyperlink"/>
@@ -2446,7 +2446,7 @@
             <w:noProof/>
             <w:webHidden/>
           </w:rPr>
-          <w:instrText xml:space="preserve"> PAGEREF _Toc243120033 \h </w:instrText>
+          <w:instrText xml:space="preserve"> PAGEREF _Toc243135942 \h </w:instrText>
         </w:r>
         <w:r>
           <w:rPr>
@@ -2487,7 +2487,7 @@
           <w:noProof/>
         </w:rPr>
       </w:pPr>
-      <w:hyperlink w:anchor="_Toc243120034" w:history="1">
+      <w:hyperlink w:anchor="_Toc243135943" w:history="1">
         <w:r>
           <w:rPr>
             <w:rStyle w:val="Hyperlink"/>
@@ -2514,7 +2514,7 @@
             <w:noProof/>
             <w:webHidden/>
           </w:rPr>
-          <w:instrText xml:space="preserve"> PAGEREF _Toc243120034 \h </w:instrText>
+          <w:instrText xml:space="preserve"> PAGEREF _Toc243135943 \h </w:instrText>
         </w:r>
         <w:r>
           <w:rPr>
@@ -2555,7 +2555,7 @@
           <w:noProof/>
         </w:rPr>
       </w:pPr>
-      <w:hyperlink w:anchor="_Toc243120035" w:history="1">
+      <w:hyperlink w:anchor="_Toc243135944" w:history="1">
         <w:r>
           <w:rPr>
             <w:rStyle w:val="Hyperlink"/>
@@ -2582,7 +2582,7 @@
             <w:noProof/>
             <w:webHidden/>
           </w:rPr>
-          <w:instrText xml:space="preserve"> PAGEREF _Toc243120035 \h </w:instrText>
+          <w:instrText xml:space="preserve"> PAGEREF _Toc243135944 \h </w:instrText>
         </w:r>
         <w:r>
           <w:rPr>
@@ -2623,7 +2623,7 @@
           <w:noProof/>
         </w:rPr>
       </w:pPr>
-      <w:hyperlink w:anchor="_Toc243120036" w:history="1">
+      <w:hyperlink w:anchor="_Toc243135945" w:history="1">
         <w:r>
           <w:rPr>
             <w:rStyle w:val="Hyperlink"/>
@@ -2650,7 +2650,7 @@
             <w:noProof/>
             <w:webHidden/>
           </w:rPr>
-          <w:instrText xml:space="preserve"> PAGEREF _Toc243120036 \h </w:instrText>
+          <w:instrText xml:space="preserve"> PAGEREF _Toc243135945 \h </w:instrText>
         </w:r>
         <w:r>
           <w:rPr>
@@ -2691,7 +2691,7 @@
           <w:noProof/>
         </w:rPr>
       </w:pPr>
-      <w:hyperlink w:anchor="_Toc243120037" w:history="1">
+      <w:hyperlink w:anchor="_Toc243135946" w:history="1">
         <w:r>
           <w:rPr>
             <w:rStyle w:val="Hyperlink"/>
@@ -2718,7 +2718,7 @@
             <w:noProof/>
             <w:webHidden/>
           </w:rPr>
-          <w:instrText xml:space="preserve"> PAGEREF _Toc243120037 \h </w:instrText>
+          <w:instrText xml:space="preserve"> PAGEREF _Toc243135946 \h </w:instrText>
         </w:r>
         <w:r>
           <w:rPr>
@@ -2738,7 +2738,7 @@
             <w:noProof/>
             <w:webHidden/>
           </w:rPr>
-          <w:t>14</w:t>
+          <w:t>15</w:t>
         </w:r>
         <w:r>
           <w:rPr>
@@ -2759,7 +2759,7 @@
           <w:noProof/>
         </w:rPr>
       </w:pPr>
-      <w:hyperlink w:anchor="_Toc243120038" w:history="1">
+      <w:hyperlink w:anchor="_Toc243135947" w:history="1">
         <w:r>
           <w:rPr>
             <w:rStyle w:val="Hyperlink"/>
@@ -2786,7 +2786,7 @@
             <w:noProof/>
             <w:webHidden/>
           </w:rPr>
-          <w:instrText xml:space="preserve"> PAGEREF _Toc243120038 \h </w:instrText>
+          <w:instrText xml:space="preserve"> PAGEREF _Toc243135947 \h </w:instrText>
         </w:r>
         <w:r>
           <w:rPr>
@@ -2827,7 +2827,7 @@
           <w:noProof/>
         </w:rPr>
       </w:pPr>
-      <w:hyperlink w:anchor="_Toc243120039" w:history="1">
+      <w:hyperlink w:anchor="_Toc243135948" w:history="1">
         <w:r>
           <w:rPr>
             <w:rStyle w:val="Hyperlink"/>
@@ -2854,7 +2854,7 @@
             <w:noProof/>
             <w:webHidden/>
           </w:rPr>
-          <w:instrText xml:space="preserve"> PAGEREF _Toc243120039 \h </w:instrText>
+          <w:instrText xml:space="preserve"> PAGEREF _Toc243135948 \h </w:instrText>
         </w:r>
         <w:r>
           <w:rPr>
@@ -2895,7 +2895,7 @@
           <w:noProof/>
         </w:rPr>
       </w:pPr>
-      <w:hyperlink w:anchor="_Toc243120040" w:history="1">
+      <w:hyperlink w:anchor="_Toc243135949" w:history="1">
         <w:r>
           <w:rPr>
             <w:rStyle w:val="Hyperlink"/>
@@ -2922,7 +2922,7 @@
             <w:noProof/>
             <w:webHidden/>
           </w:rPr>
-          <w:instrText xml:space="preserve"> PAGEREF _Toc243120040 \h </w:instrText>
+          <w:instrText xml:space="preserve"> PAGEREF _Toc243135949 \h </w:instrText>
         </w:r>
         <w:r>
           <w:rPr>
@@ -2963,7 +2963,7 @@
           <w:noProof/>
         </w:rPr>
       </w:pPr>
-      <w:hyperlink w:anchor="_Toc243120041" w:history="1">
+      <w:hyperlink w:anchor="_Toc243135950" w:history="1">
         <w:r>
           <w:rPr>
             <w:rStyle w:val="Hyperlink"/>
@@ -2990,7 +2990,7 @@
             <w:noProof/>
             <w:webHidden/>
           </w:rPr>
-          <w:instrText xml:space="preserve"> PAGEREF _Toc243120041 \h </w:instrText>
+          <w:instrText xml:space="preserve"> PAGEREF _Toc243135950 \h </w:instrText>
         </w:r>
         <w:r>
           <w:rPr>
@@ -3031,7 +3031,7 @@
           <w:noProof/>
         </w:rPr>
       </w:pPr>
-      <w:hyperlink w:anchor="_Toc243120042" w:history="1">
+      <w:hyperlink w:anchor="_Toc243135951" w:history="1">
         <w:r>
           <w:rPr>
             <w:rStyle w:val="Hyperlink"/>
@@ -3058,7 +3058,7 @@
             <w:noProof/>
             <w:webHidden/>
           </w:rPr>
-          <w:instrText xml:space="preserve"> PAGEREF _Toc243120042 \h </w:instrText>
+          <w:instrText xml:space="preserve"> PAGEREF _Toc243135951 \h </w:instrText>
         </w:r>
         <w:r>
           <w:rPr>
@@ -3099,7 +3099,7 @@
           <w:noProof/>
         </w:rPr>
       </w:pPr>
-      <w:hyperlink w:anchor="_Toc243120043" w:history="1">
+      <w:hyperlink w:anchor="_Toc243135952" w:history="1">
         <w:r>
           <w:rPr>
             <w:rStyle w:val="Hyperlink"/>
@@ -3126,7 +3126,7 @@
             <w:noProof/>
             <w:webHidden/>
           </w:rPr>
-          <w:instrText xml:space="preserve"> PAGEREF _Toc243120043 \h </w:instrText>
+          <w:instrText xml:space="preserve"> PAGEREF _Toc243135952 \h </w:instrText>
         </w:r>
         <w:r>
           <w:rPr>
@@ -3167,13 +3167,13 @@
           <w:noProof/>
         </w:rPr>
       </w:pPr>
-      <w:hyperlink w:anchor="_Toc243120044" w:history="1">
+      <w:hyperlink w:anchor="_Toc243135953" w:history="1">
         <w:r>
           <w:rPr>
             <w:rStyle w:val="Hyperlink"/>
             <w:noProof/>
           </w:rPr>
-          <w:t>9.4 Reading the books — Reports and the audit trail</w:t>
+          <w:t>9.4 Reading the books — Reports</w:t>
         </w:r>
         <w:r>
           <w:rPr>
@@ -3194,7 +3194,7 @@
             <w:noProof/>
             <w:webHidden/>
           </w:rPr>
-          <w:instrText xml:space="preserve"> PAGEREF _Toc243120044 \h </w:instrText>
+          <w:instrText xml:space="preserve"> PAGEREF _Toc243135953 \h </w:instrText>
         </w:r>
         <w:r>
           <w:rPr>
@@ -3235,7 +3235,7 @@
           <w:noProof/>
         </w:rPr>
       </w:pPr>
-      <w:hyperlink w:anchor="_Toc243120045" w:history="1">
+      <w:hyperlink w:anchor="_Toc243135954" w:history="1">
         <w:r>
           <w:rPr>
             <w:rStyle w:val="Hyperlink"/>
@@ -3262,7 +3262,7 @@
             <w:noProof/>
             <w:webHidden/>
           </w:rPr>
-          <w:instrText xml:space="preserve"> PAGEREF _Toc243120045 \h </w:instrText>
+          <w:instrText xml:space="preserve"> PAGEREF _Toc243135954 \h </w:instrText>
         </w:r>
         <w:r>
           <w:rPr>
@@ -3282,7 +3282,7 @@
             <w:noProof/>
             <w:webHidden/>
           </w:rPr>
-          <w:t>16</w:t>
+          <w:t>17</w:t>
         </w:r>
         <w:r>
           <w:rPr>
@@ -3303,7 +3303,7 @@
           <w:noProof/>
         </w:rPr>
       </w:pPr>
-      <w:hyperlink w:anchor="_Toc243120046" w:history="1">
+      <w:hyperlink w:anchor="_Toc243135955" w:history="1">
         <w:r>
           <w:rPr>
             <w:rStyle w:val="Hyperlink"/>
@@ -3330,7 +3330,7 @@
             <w:noProof/>
             <w:webHidden/>
           </w:rPr>
-          <w:instrText xml:space="preserve"> PAGEREF _Toc243120046 \h </w:instrText>
+          <w:instrText xml:space="preserve"> PAGEREF _Toc243135955 \h </w:instrText>
         </w:r>
         <w:r>
           <w:rPr>
@@ -3371,7 +3371,7 @@
           <w:noProof/>
         </w:rPr>
       </w:pPr>
-      <w:hyperlink w:anchor="_Toc243120047" w:history="1">
+      <w:hyperlink w:anchor="_Toc243135956" w:history="1">
         <w:r>
           <w:rPr>
             <w:rStyle w:val="Hyperlink"/>
@@ -3398,7 +3398,7 @@
             <w:noProof/>
             <w:webHidden/>
           </w:rPr>
-          <w:instrText xml:space="preserve"> PAGEREF _Toc243120047 \h </w:instrText>
+          <w:instrText xml:space="preserve"> PAGEREF _Toc243135956 \h </w:instrText>
         </w:r>
         <w:r>
           <w:rPr>
@@ -3439,7 +3439,7 @@
           <w:noProof/>
         </w:rPr>
       </w:pPr>
-      <w:hyperlink w:anchor="_Toc243120048" w:history="1">
+      <w:hyperlink w:anchor="_Toc243135957" w:history="1">
         <w:r>
           <w:rPr>
             <w:rStyle w:val="Hyperlink"/>
@@ -3466,7 +3466,7 @@
             <w:noProof/>
             <w:webHidden/>
           </w:rPr>
-          <w:instrText xml:space="preserve"> PAGEREF _Toc243120048 \h </w:instrText>
+          <w:instrText xml:space="preserve"> PAGEREF _Toc243135957 \h </w:instrText>
         </w:r>
         <w:r>
           <w:rPr>
@@ -3507,7 +3507,7 @@
           <w:noProof/>
         </w:rPr>
       </w:pPr>
-      <w:hyperlink w:anchor="_Toc243120049" w:history="1">
+      <w:hyperlink w:anchor="_Toc243135958" w:history="1">
         <w:r>
           <w:rPr>
             <w:rStyle w:val="Hyperlink"/>
@@ -3534,7 +3534,7 @@
             <w:noProof/>
             <w:webHidden/>
           </w:rPr>
-          <w:instrText xml:space="preserve"> PAGEREF _Toc243120049 \h </w:instrText>
+          <w:instrText xml:space="preserve"> PAGEREF _Toc243135958 \h </w:instrText>
         </w:r>
         <w:r>
           <w:rPr>
@@ -3575,7 +3575,7 @@
           <w:noProof/>
         </w:rPr>
       </w:pPr>
-      <w:hyperlink w:anchor="_Toc243120050" w:history="1">
+      <w:hyperlink w:anchor="_Toc243135959" w:history="1">
         <w:r>
           <w:rPr>
             <w:rStyle w:val="Hyperlink"/>
@@ -3602,7 +3602,7 @@
             <w:noProof/>
             <w:webHidden/>
           </w:rPr>
-          <w:instrText xml:space="preserve"> PAGEREF _Toc243120050 \h </w:instrText>
+          <w:instrText xml:space="preserve"> PAGEREF _Toc243135959 \h </w:instrText>
         </w:r>
         <w:r>
           <w:rPr>
@@ -3622,7 +3622,7 @@
             <w:noProof/>
             <w:webHidden/>
           </w:rPr>
-          <w:t>17</w:t>
+          <w:t>18</w:t>
         </w:r>
         <w:r>
           <w:rPr>
@@ -3643,7 +3643,7 @@
           <w:noProof/>
         </w:rPr>
       </w:pPr>
-      <w:hyperlink w:anchor="_Toc243120051" w:history="1">
+      <w:hyperlink w:anchor="_Toc243135960" w:history="1">
         <w:r>
           <w:rPr>
             <w:rStyle w:val="Hyperlink"/>
@@ -3670,7 +3670,7 @@
             <w:noProof/>
             <w:webHidden/>
           </w:rPr>
-          <w:instrText xml:space="preserve"> PAGEREF _Toc243120051 \h </w:instrText>
+          <w:instrText xml:space="preserve"> PAGEREF _Toc243135960 \h </w:instrText>
         </w:r>
         <w:r>
           <w:rPr>
@@ -3711,7 +3711,7 @@
           <w:noProof/>
         </w:rPr>
       </w:pPr>
-      <w:hyperlink w:anchor="_Toc243120052" w:history="1">
+      <w:hyperlink w:anchor="_Toc243135961" w:history="1">
         <w:r>
           <w:rPr>
             <w:rStyle w:val="Hyperlink"/>
@@ -3738,7 +3738,7 @@
             <w:noProof/>
             <w:webHidden/>
           </w:rPr>
-          <w:instrText xml:space="preserve"> PAGEREF _Toc243120052 \h </w:instrText>
+          <w:instrText xml:space="preserve"> PAGEREF _Toc243135961 \h </w:instrText>
         </w:r>
         <w:r>
           <w:rPr>
@@ -3779,7 +3779,7 @@
           <w:noProof/>
         </w:rPr>
       </w:pPr>
-      <w:hyperlink w:anchor="_Toc243120053" w:history="1">
+      <w:hyperlink w:anchor="_Toc243135962" w:history="1">
         <w:r>
           <w:rPr>
             <w:rStyle w:val="Hyperlink"/>
@@ -3806,7 +3806,7 @@
             <w:noProof/>
             <w:webHidden/>
           </w:rPr>
-          <w:instrText xml:space="preserve"> PAGEREF _Toc243120053 \h </w:instrText>
+          <w:instrText xml:space="preserve"> PAGEREF _Toc243135962 \h </w:instrText>
         </w:r>
         <w:r>
           <w:rPr>
@@ -3847,7 +3847,7 @@
           <w:noProof/>
         </w:rPr>
       </w:pPr>
-      <w:hyperlink w:anchor="_Toc243120054" w:history="1">
+      <w:hyperlink w:anchor="_Toc243135963" w:history="1">
         <w:r>
           <w:rPr>
             <w:rStyle w:val="Hyperlink"/>
@@ -3874,7 +3874,7 @@
             <w:noProof/>
             <w:webHidden/>
           </w:rPr>
-          <w:instrText xml:space="preserve"> PAGEREF _Toc243120054 \h </w:instrText>
+          <w:instrText xml:space="preserve"> PAGEREF _Toc243135963 \h </w:instrText>
         </w:r>
         <w:r>
           <w:rPr>
@@ -3915,7 +3915,7 @@
           <w:noProof/>
         </w:rPr>
       </w:pPr>
-      <w:hyperlink w:anchor="_Toc243120055" w:history="1">
+      <w:hyperlink w:anchor="_Toc243135964" w:history="1">
         <w:r>
           <w:rPr>
             <w:rStyle w:val="Hyperlink"/>
@@ -3942,7 +3942,7 @@
             <w:noProof/>
             <w:webHidden/>
           </w:rPr>
-          <w:instrText xml:space="preserve"> PAGEREF _Toc243120055 \h </w:instrText>
+          <w:instrText xml:space="preserve"> PAGEREF _Toc243135964 \h </w:instrText>
         </w:r>
         <w:r>
           <w:rPr>
@@ -3983,7 +3983,7 @@
           <w:noProof/>
         </w:rPr>
       </w:pPr>
-      <w:hyperlink w:anchor="_Toc243120056" w:history="1">
+      <w:hyperlink w:anchor="_Toc243135965" w:history="1">
         <w:r>
           <w:rPr>
             <w:rStyle w:val="Hyperlink"/>
@@ -4010,7 +4010,7 @@
             <w:noProof/>
             <w:webHidden/>
           </w:rPr>
-          <w:instrText xml:space="preserve"> PAGEREF _Toc243120056 \h </w:instrText>
+          <w:instrText xml:space="preserve"> PAGEREF _Toc243135965 \h </w:instrText>
         </w:r>
         <w:r>
           <w:rPr>
@@ -4051,7 +4051,7 @@
           <w:noProof/>
         </w:rPr>
       </w:pPr>
-      <w:hyperlink w:anchor="_Toc243120057" w:history="1">
+      <w:hyperlink w:anchor="_Toc243135966" w:history="1">
         <w:r>
           <w:rPr>
             <w:rStyle w:val="Hyperlink"/>
@@ -4078,7 +4078,7 @@
             <w:noProof/>
             <w:webHidden/>
           </w:rPr>
-          <w:instrText xml:space="preserve"> PAGEREF _Toc243120057 \h </w:instrText>
+          <w:instrText xml:space="preserve"> PAGEREF _Toc243135966 \h </w:instrText>
         </w:r>
         <w:r>
           <w:rPr>
@@ -4119,7 +4119,7 @@
           <w:noProof/>
         </w:rPr>
       </w:pPr>
-      <w:hyperlink w:anchor="_Toc243120058" w:history="1">
+      <w:hyperlink w:anchor="_Toc243135967" w:history="1">
         <w:r>
           <w:rPr>
             <w:rStyle w:val="Hyperlink"/>
@@ -4146,7 +4146,7 @@
             <w:noProof/>
             <w:webHidden/>
           </w:rPr>
-          <w:instrText xml:space="preserve"> PAGEREF _Toc243120058 \h </w:instrText>
+          <w:instrText xml:space="preserve"> PAGEREF _Toc243135967 \h </w:instrText>
         </w:r>
         <w:r>
           <w:rPr>
@@ -4187,7 +4187,7 @@
           <w:noProof/>
         </w:rPr>
       </w:pPr>
-      <w:hyperlink w:anchor="_Toc243120059" w:history="1">
+      <w:hyperlink w:anchor="_Toc243135968" w:history="1">
         <w:r>
           <w:rPr>
             <w:rStyle w:val="Hyperlink"/>
@@ -4214,7 +4214,7 @@
             <w:noProof/>
             <w:webHidden/>
           </w:rPr>
-          <w:instrText xml:space="preserve"> PAGEREF _Toc243120059 \h </w:instrText>
+          <w:instrText xml:space="preserve"> PAGEREF _Toc243135968 \h </w:instrText>
         </w:r>
         <w:r>
           <w:rPr>
@@ -4234,7 +4234,7 @@
             <w:noProof/>
             <w:webHidden/>
           </w:rPr>
-          <w:t>22</w:t>
+          <w:t>23</w:t>
         </w:r>
         <w:r>
           <w:rPr>
@@ -4255,7 +4255,7 @@
           <w:noProof/>
         </w:rPr>
       </w:pPr>
-      <w:hyperlink w:anchor="_Toc243120060" w:history="1">
+      <w:hyperlink w:anchor="_Toc243135969" w:history="1">
         <w:r>
           <w:rPr>
             <w:rStyle w:val="Hyperlink"/>
@@ -4282,7 +4282,7 @@
             <w:noProof/>
             <w:webHidden/>
           </w:rPr>
-          <w:instrText xml:space="preserve"> PAGEREF _Toc243120060 \h </w:instrText>
+          <w:instrText xml:space="preserve"> PAGEREF _Toc243135969 \h </w:instrText>
         </w:r>
         <w:r>
           <w:rPr>
@@ -4323,7 +4323,7 @@
           <w:noProof/>
         </w:rPr>
       </w:pPr>
-      <w:hyperlink w:anchor="_Toc243120061" w:history="1">
+      <w:hyperlink w:anchor="_Toc243135970" w:history="1">
         <w:r>
           <w:rPr>
             <w:rStyle w:val="Hyperlink"/>
@@ -4350,7 +4350,7 @@
             <w:noProof/>
             <w:webHidden/>
           </w:rPr>
-          <w:instrText xml:space="preserve"> PAGEREF _Toc243120061 \h </w:instrText>
+          <w:instrText xml:space="preserve"> PAGEREF _Toc243135970 \h </w:instrText>
         </w:r>
         <w:r>
           <w:rPr>
@@ -4391,7 +4391,7 @@
           <w:noProof/>
         </w:rPr>
       </w:pPr>
-      <w:hyperlink w:anchor="_Toc243120062" w:history="1">
+      <w:hyperlink w:anchor="_Toc243135971" w:history="1">
         <w:r>
           <w:rPr>
             <w:rStyle w:val="Hyperlink"/>
@@ -4418,7 +4418,7 @@
             <w:noProof/>
             <w:webHidden/>
           </w:rPr>
-          <w:instrText xml:space="preserve"> PAGEREF _Toc243120062 \h </w:instrText>
+          <w:instrText xml:space="preserve"> PAGEREF _Toc243135971 \h </w:instrText>
         </w:r>
         <w:r>
           <w:rPr>
@@ -4459,7 +4459,7 @@
           <w:noProof/>
         </w:rPr>
       </w:pPr>
-      <w:hyperlink w:anchor="_Toc243120063" w:history="1">
+      <w:hyperlink w:anchor="_Toc243135972" w:history="1">
         <w:r>
           <w:rPr>
             <w:rStyle w:val="Hyperlink"/>
@@ -4486,7 +4486,7 @@
             <w:noProof/>
             <w:webHidden/>
           </w:rPr>
-          <w:instrText xml:space="preserve"> PAGEREF _Toc243120063 \h </w:instrText>
+          <w:instrText xml:space="preserve"> PAGEREF _Toc243135972 \h </w:instrText>
         </w:r>
         <w:r>
           <w:rPr>
@@ -4527,7 +4527,7 @@
           <w:noProof/>
         </w:rPr>
       </w:pPr>
-      <w:hyperlink w:anchor="_Toc243120064" w:history="1">
+      <w:hyperlink w:anchor="_Toc243135973" w:history="1">
         <w:r>
           <w:rPr>
             <w:rStyle w:val="Hyperlink"/>
@@ -4554,7 +4554,7 @@
             <w:noProof/>
             <w:webHidden/>
           </w:rPr>
-          <w:instrText xml:space="preserve"> PAGEREF _Toc243120064 \h </w:instrText>
+          <w:instrText xml:space="preserve"> PAGEREF _Toc243135973 \h </w:instrText>
         </w:r>
         <w:r>
           <w:rPr>
@@ -4595,7 +4595,7 @@
           <w:noProof/>
         </w:rPr>
       </w:pPr>
-      <w:hyperlink w:anchor="_Toc243120065" w:history="1">
+      <w:hyperlink w:anchor="_Toc243135974" w:history="1">
         <w:r>
           <w:rPr>
             <w:rStyle w:val="Hyperlink"/>
@@ -4622,7 +4622,7 @@
             <w:noProof/>
             <w:webHidden/>
           </w:rPr>
-          <w:instrText xml:space="preserve"> PAGEREF _Toc243120065 \h </w:instrText>
+          <w:instrText xml:space="preserve"> PAGEREF _Toc243135974 \h </w:instrText>
         </w:r>
         <w:r>
           <w:rPr>
@@ -4663,7 +4663,7 @@
           <w:noProof/>
         </w:rPr>
       </w:pPr>
-      <w:hyperlink w:anchor="_Toc243120066" w:history="1">
+      <w:hyperlink w:anchor="_Toc243135975" w:history="1">
         <w:r>
           <w:rPr>
             <w:rStyle w:val="Hyperlink"/>
@@ -4690,7 +4690,7 @@
             <w:noProof/>
             <w:webHidden/>
           </w:rPr>
-          <w:instrText xml:space="preserve"> PAGEREF _Toc243120066 \h </w:instrText>
+          <w:instrText xml:space="preserve"> PAGEREF _Toc243135975 \h </w:instrText>
         </w:r>
         <w:r>
           <w:rPr>
@@ -4731,7 +4731,7 @@
           <w:noProof/>
         </w:rPr>
       </w:pPr>
-      <w:hyperlink w:anchor="_Toc243120067" w:history="1">
+      <w:hyperlink w:anchor="_Toc243135976" w:history="1">
         <w:r>
           <w:rPr>
             <w:rStyle w:val="Hyperlink"/>
@@ -4758,7 +4758,7 @@
             <w:noProof/>
             <w:webHidden/>
           </w:rPr>
-          <w:instrText xml:space="preserve"> PAGEREF _Toc243120067 \h </w:instrText>
+          <w:instrText xml:space="preserve"> PAGEREF _Toc243135976 \h </w:instrText>
         </w:r>
         <w:r>
           <w:rPr>
@@ -4799,7 +4799,7 @@
           <w:noProof/>
         </w:rPr>
       </w:pPr>
-      <w:hyperlink w:anchor="_Toc243120068" w:history="1">
+      <w:hyperlink w:anchor="_Toc243135977" w:history="1">
         <w:r>
           <w:rPr>
             <w:rStyle w:val="Hyperlink"/>
@@ -4826,7 +4826,7 @@
             <w:noProof/>
             <w:webHidden/>
           </w:rPr>
-          <w:instrText xml:space="preserve"> PAGEREF _Toc243120068 \h </w:instrText>
+          <w:instrText xml:space="preserve"> PAGEREF _Toc243135977 \h </w:instrText>
         </w:r>
         <w:r>
           <w:rPr>
@@ -4871,7 +4871,7 @@
       <w:pPr>
         <w:pStyle w:val="Heading1"/>
       </w:pPr>
-      <w:bookmarkStart w:id="1" w:name="_Toc243120003"/>
+      <w:bookmarkStart w:id="1" w:name="_Toc243135912"/>
       <w:r>
         <w:lastRenderedPageBreak/>
         <w:t>1. How to read this guide</w:t>
@@ -4978,7 +4978,7 @@
       <w:pPr>
         <w:pStyle w:val="Heading1"/>
       </w:pPr>
-      <w:bookmarkStart w:id="2" w:name="_Toc243120004"/>
+      <w:bookmarkStart w:id="2" w:name="_Toc243135913"/>
       <w:r>
         <w:t>2. The system in one minute</w:t>
       </w:r>
@@ -5137,7 +5137,7 @@
       <w:pPr>
         <w:pStyle w:val="Heading1"/>
       </w:pPr>
-      <w:bookmarkStart w:id="3" w:name="_Toc243120005"/>
+      <w:bookmarkStart w:id="3" w:name="_Toc243135914"/>
       <w:r>
         <w:t>3. The six users at a glance</w:t>
       </w:r>
@@ -5834,7 +5834,7 @@
       <w:pPr>
         <w:pStyle w:val="Heading1"/>
       </w:pPr>
-      <w:bookmarkStart w:id="4" w:name="_Toc243120006"/>
+      <w:bookmarkStart w:id="4" w:name="_Toc243135915"/>
       <w:r>
         <w:t>4. The member — no account, one key</w:t>
       </w:r>
@@ -5857,7 +5857,7 @@
       <w:pPr>
         <w:pStyle w:val="Heading2"/>
       </w:pPr>
-      <w:bookmarkStart w:id="5" w:name="_Toc243120007"/>
+      <w:bookmarkStart w:id="5" w:name="_Toc243135916"/>
       <w:r>
         <w:t>4.1 What he sees when he opens the site</w:t>
       </w:r>
@@ -5875,7 +5875,7 @@
       <w:pPr>
         <w:pStyle w:val="Heading2"/>
       </w:pPr>
-      <w:bookmarkStart w:id="6" w:name="_Toc243120008"/>
+      <w:bookmarkStart w:id="6" w:name="_Toc243135917"/>
       <w:r>
         <w:t>4.2 The gate: how he gets in</w:t>
       </w:r>
@@ -6026,7 +6026,7 @@
       <w:pPr>
         <w:pStyle w:val="Heading2"/>
       </w:pPr>
-      <w:bookmarkStart w:id="7" w:name="_Toc243120009"/>
+      <w:bookmarkStart w:id="7" w:name="_Toc243135918"/>
       <w:r>
         <w:t>4.3 His own record: the passbook</w:t>
       </w:r>
@@ -6164,7 +6164,7 @@
       <w:pPr>
         <w:pStyle w:val="Heading2"/>
       </w:pPr>
-      <w:bookmarkStart w:id="8" w:name="_Toc243120010"/>
+      <w:bookmarkStart w:id="8" w:name="_Toc243135919"/>
       <w:r>
         <w:t>4.4 What he can download</w:t>
       </w:r>
@@ -6236,7 +6236,7 @@
       <w:pPr>
         <w:pStyle w:val="Heading2"/>
       </w:pPr>
-      <w:bookmarkStart w:id="9" w:name="_Toc243120011"/>
+      <w:bookmarkStart w:id="9" w:name="_Toc243135920"/>
       <w:r>
         <w:t>4.5 The members' area: documents, minutes, the constitution</w:t>
       </w:r>
@@ -6316,7 +6316,7 @@
       <w:pPr>
         <w:pStyle w:val="Heading2"/>
       </w:pPr>
-      <w:bookmarkStart w:id="10" w:name="_Toc243120012"/>
+      <w:bookmarkStart w:id="10" w:name="_Toc243135921"/>
       <w:r>
         <w:t>4.6 What a member can never do</w:t>
       </w:r>
@@ -6370,7 +6370,7 @@
       <w:pPr>
         <w:pStyle w:val="Heading2"/>
       </w:pPr>
-      <w:bookmarkStart w:id="11" w:name="_Toc243120013"/>
+      <w:bookmarkStart w:id="11" w:name="_Toc243135922"/>
       <w:r>
         <w:t>4.7 A member's five minutes, step by step</w:t>
       </w:r>
@@ -6446,7 +6446,7 @@
       <w:pPr>
         <w:pStyle w:val="Heading2"/>
       </w:pPr>
-      <w:bookmarkStart w:id="12" w:name="_Toc243120014"/>
+      <w:bookmarkStart w:id="12" w:name="_Toc243135923"/>
       <w:r>
         <w:t>4.8 If a member says the figure is wrong</w:t>
       </w:r>
@@ -6508,7 +6508,7 @@
       <w:pPr>
         <w:pStyle w:val="Heading1"/>
       </w:pPr>
-      <w:bookmarkStart w:id="13" w:name="_Toc243120015"/>
+      <w:bookmarkStart w:id="13" w:name="_Toc243135924"/>
       <w:r>
         <w:t>5. Staff accounts: what every role shares</w:t>
       </w:r>
@@ -6531,7 +6531,7 @@
       <w:pPr>
         <w:pStyle w:val="Heading2"/>
       </w:pPr>
-      <w:bookmarkStart w:id="14" w:name="_Toc243120016"/>
+      <w:bookmarkStart w:id="14" w:name="_Toc243135925"/>
       <w:r>
         <w:t>5.1 Getting in</w:t>
       </w:r>
@@ -6721,7 +6721,7 @@
       <w:pPr>
         <w:pStyle w:val="Heading2"/>
       </w:pPr>
-      <w:bookmarkStart w:id="15" w:name="_Toc243120017"/>
+      <w:bookmarkStart w:id="15" w:name="_Toc243135926"/>
       <w:r>
         <w:t>5.2 Two-factor authentication (2FA)</w:t>
       </w:r>
@@ -6833,7 +6833,7 @@
       <w:pPr>
         <w:pStyle w:val="Heading2"/>
       </w:pPr>
-      <w:bookmarkStart w:id="16" w:name="_Toc243120018"/>
+      <w:bookmarkStart w:id="16" w:name="_Toc243135927"/>
       <w:r>
         <w:t>5.3 The menu each role gets</w:t>
       </w:r>
@@ -7004,7 +7004,7 @@
                 <w:rFonts w:eastAsia="Calibri" w:cs="Calibri"/>
                 <w:sz w:val="18"/>
               </w:rPr>
-              <w:t>Dashboard · Members · Finance · Reports · Reminders · Docs · Audit (+ My account)</w:t>
+              <w:t>Dashboard · Members · Finance · Loans · Reports · Reminders · Docs (+ My account)</w:t>
             </w:r>
           </w:p>
         </w:tc>
@@ -7042,7 +7042,7 @@
                 <w:rFonts w:eastAsia="Calibri" w:cs="Calibri"/>
                 <w:sz w:val="18"/>
               </w:rPr>
-              <w:t>Reports · Minutes · Docs · Audit (+ My account)</w:t>
+              <w:t>Reports · Minutes · Docs (+ My account)</w:t>
             </w:r>
           </w:p>
         </w:tc>
@@ -7093,7 +7093,7 @@
       <w:pPr>
         <w:pStyle w:val="Heading2"/>
       </w:pPr>
-      <w:bookmarkStart w:id="17" w:name="_Toc243120019"/>
+      <w:bookmarkStart w:id="17" w:name="_Toc243135928"/>
       <w:r>
         <w:t>5.4 What the office dashboard is</w:t>
       </w:r>
@@ -7111,7 +7111,7 @@
       <w:pPr>
         <w:pStyle w:val="Heading1"/>
       </w:pPr>
-      <w:bookmarkStart w:id="18" w:name="_Toc243120020"/>
+      <w:bookmarkStart w:id="18" w:name="_Toc243135929"/>
       <w:r>
         <w:t>6. The super admin — the account that can put things right</w:t>
       </w:r>
@@ -7134,7 +7134,7 @@
       <w:pPr>
         <w:pStyle w:val="Heading2"/>
       </w:pPr>
-      <w:bookmarkStart w:id="19" w:name="_Toc243120021"/>
+      <w:bookmarkStart w:id="19" w:name="_Toc243135930"/>
       <w:r>
         <w:t>6.1 The account itself</w:t>
       </w:r>
@@ -7216,7 +7216,7 @@
       <w:pPr>
         <w:pStyle w:val="Heading2"/>
       </w:pPr>
-      <w:bookmarkStart w:id="20" w:name="_Toc243120022"/>
+      <w:bookmarkStart w:id="20" w:name="_Toc243135931"/>
       <w:r>
         <w:t>6.2 Work only the super admin can do</w:t>
       </w:r>
@@ -7352,7 +7352,7 @@
       <w:pPr>
         <w:pStyle w:val="Heading2"/>
       </w:pPr>
-      <w:bookmarkStart w:id="21" w:name="_Toc243120023"/>
+      <w:bookmarkStart w:id="21" w:name="_Toc243135932"/>
       <w:r>
         <w:t>6.3 A super admin's working session</w:t>
       </w:r>
@@ -7501,7 +7501,7 @@
       <w:pPr>
         <w:pStyle w:val="Heading2"/>
       </w:pPr>
-      <w:bookmarkStart w:id="22" w:name="_Toc243120024"/>
+      <w:bookmarkStart w:id="22" w:name="_Toc243135933"/>
       <w:r>
         <w:t>6.4 Backups on the free host</w:t>
       </w:r>
@@ -7601,7 +7601,7 @@
       <w:pPr>
         <w:pStyle w:val="Heading2"/>
       </w:pPr>
-      <w:bookmarkStart w:id="23" w:name="_Toc243120025"/>
+      <w:bookmarkStart w:id="23" w:name="_Toc243135934"/>
       <w:r>
         <w:t>6.5 The Control Room</w:t>
       </w:r>
@@ -7824,7 +7824,7 @@
       <w:pPr>
         <w:pStyle w:val="Heading2"/>
       </w:pPr>
-      <w:bookmarkStart w:id="24" w:name="_Toc243120026"/>
+      <w:bookmarkStart w:id="24" w:name="_Toc243135935"/>
       <w:r>
         <w:t>6.6 What even the super admin cannot do</w:t>
       </w:r>
@@ -7882,7 +7882,7 @@
       <w:pPr>
         <w:pStyle w:val="Heading1"/>
       </w:pPr>
-      <w:bookmarkStart w:id="25" w:name="_Toc243120027"/>
+      <w:bookmarkStart w:id="25" w:name="_Toc243135936"/>
       <w:r>
         <w:t>7. The admin — the office, day to day</w:t>
       </w:r>
@@ -7905,7 +7905,7 @@
       <w:pPr>
         <w:pStyle w:val="Heading2"/>
       </w:pPr>
-      <w:bookmarkStart w:id="26" w:name="_Toc243120028"/>
+      <w:bookmarkStart w:id="26" w:name="_Toc243135937"/>
       <w:r>
         <w:t>7.1 The account</w:t>
       </w:r>
@@ -7969,7 +7969,7 @@
       <w:pPr>
         <w:pStyle w:val="Heading2"/>
       </w:pPr>
-      <w:bookmarkStart w:id="27" w:name="_Toc243120029"/>
+      <w:bookmarkStart w:id="27" w:name="_Toc243135938"/>
       <w:r>
         <w:t>7.2 What the admin does — and gets</w:t>
       </w:r>
@@ -8275,7 +8275,7 @@
       <w:pPr>
         <w:pStyle w:val="Heading2"/>
       </w:pPr>
-      <w:bookmarkStart w:id="28" w:name="_Toc243120030"/>
+      <w:bookmarkStart w:id="28" w:name="_Toc243135939"/>
       <w:r>
         <w:t>7.3 What an admin cannot do</w:t>
       </w:r>
@@ -8355,7 +8355,7 @@
       <w:pPr>
         <w:pStyle w:val="Heading2"/>
       </w:pPr>
-      <w:bookmarkStart w:id="29" w:name="_Toc243120031"/>
+      <w:bookmarkStart w:id="29" w:name="_Toc243135940"/>
       <w:r>
         <w:t>7.4 The two fine decisions worth knowing</w:t>
       </w:r>
@@ -8427,7 +8427,7 @@
       <w:pPr>
         <w:pStyle w:val="Heading2"/>
       </w:pPr>
-      <w:bookmarkStart w:id="30" w:name="_Toc243120032"/>
+      <w:bookmarkStart w:id="30" w:name="_Toc243135941"/>
       <w:r>
         <w:t>7.5 Loans, and the one decision that is the admin's</w:t>
       </w:r>
@@ -8581,7 +8581,7 @@
       <w:pPr>
         <w:pStyle w:val="Heading1"/>
       </w:pPr>
-      <w:bookmarkStart w:id="31" w:name="_Toc243120033"/>
+      <w:bookmarkStart w:id="31" w:name="_Toc243135942"/>
       <w:r>
         <w:t>8. The treasurer — the ledger, the week cycle and the numbers</w:t>
       </w:r>
@@ -8604,7 +8604,7 @@
       <w:pPr>
         <w:pStyle w:val="Heading2"/>
       </w:pPr>
-      <w:bookmarkStart w:id="32" w:name="_Toc243120034"/>
+      <w:bookmarkStart w:id="32" w:name="_Toc243135943"/>
       <w:r>
         <w:t>8.1 The account</w:t>
       </w:r>
@@ -8661,14 +8661,14 @@
         <w:rPr>
           <w:rFonts w:eastAsia="Calibri" w:cs="Calibri"/>
         </w:rPr>
-        <w:t xml:space="preserve"> Dashboard · Members · Finance · Loans · Reports · Reminders · Docs · Audit.</w:t>
+        <w:t xml:space="preserve"> Dashboard · Members · Finance · Loans · Reports · Reminders · Docs. (There is no Audit: the audit trail is for the admins only.)</w:t>
       </w:r>
     </w:p>
     <w:p>
       <w:pPr>
         <w:pStyle w:val="Heading2"/>
       </w:pPr>
-      <w:bookmarkStart w:id="33" w:name="_Toc243120035"/>
+      <w:bookmarkStart w:id="33" w:name="_Toc243135944"/>
       <w:r>
         <w:t>8.2 The ledger, as the treasurer works it</w:t>
       </w:r>
@@ -8804,7 +8804,7 @@
       <w:pPr>
         <w:pStyle w:val="Heading2"/>
       </w:pPr>
-      <w:bookmarkStart w:id="34" w:name="_Toc243120036"/>
+      <w:bookmarkStart w:id="34" w:name="_Toc243135945"/>
       <w:r>
         <w:t>8.3 What the treasurer gets out</w:t>
       </w:r>
@@ -8890,27 +8890,14 @@
         <w:rPr>
           <w:rFonts w:eastAsia="Calibri" w:cs="Calibri"/>
         </w:rPr>
-        <w:t xml:space="preserve"> (.xlsx or CSV) and the </w:t>
-      </w:r>
-      <w:r>
-        <w:rPr>
-          <w:rFonts w:eastAsia="Calibri" w:cs="Calibri"/>
-          <w:b/>
-        </w:rPr>
-        <w:t>audit trail</w:t>
-      </w:r>
-      <w:r>
-        <w:rPr>
-          <w:rFonts w:eastAsia="Calibri" w:cs="Calibri"/>
-        </w:rPr>
-        <w:t xml:space="preserve"> with its own export.</w:t>
+        <w:t xml:space="preserve"> (.xlsx or CSV). Not the audit trail: that is for the admins only, and an admin can export it for a meeting.</w:t>
       </w:r>
     </w:p>
     <w:p>
       <w:pPr>
         <w:pStyle w:val="Heading2"/>
       </w:pPr>
-      <w:bookmarkStart w:id="35" w:name="_Toc243120037"/>
+      <w:bookmarkStart w:id="35" w:name="_Toc243135946"/>
       <w:r>
         <w:t>8.4 What the treasurer cannot do</w:t>
       </w:r>
@@ -9061,7 +9048,7 @@
       <w:pPr>
         <w:pStyle w:val="Heading2"/>
       </w:pPr>
-      <w:bookmarkStart w:id="36" w:name="_Toc243120038"/>
+      <w:bookmarkStart w:id="36" w:name="_Toc243135947"/>
       <w:r>
         <w:t>8.5 A Thursday close, step by step</w:t>
       </w:r>
@@ -9176,7 +9163,7 @@
       <w:pPr>
         <w:pStyle w:val="Heading2"/>
       </w:pPr>
-      <w:bookmarkStart w:id="37" w:name="_Toc243120039"/>
+      <w:bookmarkStart w:id="37" w:name="_Toc243135948"/>
       <w:r>
         <w:t>8.6 The three fields the treasurer may fill in but not replace</w:t>
       </w:r>
@@ -9296,7 +9283,7 @@
       <w:pPr>
         <w:pStyle w:val="Heading1"/>
       </w:pPr>
-      <w:bookmarkStart w:id="38" w:name="_Toc243120040"/>
+      <w:bookmarkStart w:id="38" w:name="_Toc243135949"/>
       <w:r>
         <w:t>9. The secretary — the group's paperwork, and reading the books</w:t>
       </w:r>
@@ -9312,14 +9299,14 @@
           <w:i/>
           <w:color w:val="5A645E"/>
         </w:rPr>
-        <w:t>The secretary writes the minutes and files the group's papers, and reads everything the office records without being able to change any of it. It is the role a group gives to whoever keeps its records straight, and to an auditor who must verify without touching.</w:t>
+        <w:t>The secretary writes the minutes and files the group's papers, and reads the reports without being able to change any of them. It is the role a group gives to whoever keeps its records straight. It does not read the audit trail; that is the admins' alone.</w:t>
       </w:r>
     </w:p>
     <w:p>
       <w:pPr>
         <w:pStyle w:val="Heading2"/>
       </w:pPr>
-      <w:bookmarkStart w:id="39" w:name="_Toc243120041"/>
+      <w:bookmarkStart w:id="39" w:name="_Toc243135950"/>
       <w:r>
         <w:t>9.1 The account</w:t>
       </w:r>
@@ -9376,14 +9363,14 @@
         <w:rPr>
           <w:rFonts w:eastAsia="Calibri" w:cs="Calibri"/>
         </w:rPr>
-        <w:t xml:space="preserve"> Reports · Minutes · Docs · Audit. There is no dashboard, no Members and no Finance: the money screens are not this role's, and hiding them is how that is taught.</w:t>
+        <w:t xml:space="preserve"> Reports · Minutes · Docs. There is no dashboard, no Members, no Finance and no Audit: the money screens are not this role's, and hiding them is how that is taught.</w:t>
       </w:r>
     </w:p>
     <w:p>
       <w:pPr>
         <w:pStyle w:val="Heading2"/>
       </w:pPr>
-      <w:bookmarkStart w:id="40" w:name="_Toc243120042"/>
+      <w:bookmarkStart w:id="40" w:name="_Toc243135951"/>
       <w:r>
         <w:t>9.2 The minutes — what the secretary is for</w:t>
       </w:r>
@@ -9483,7 +9470,7 @@
       <w:pPr>
         <w:pStyle w:val="Heading2"/>
       </w:pPr>
-      <w:bookmarkStart w:id="41" w:name="_Toc243120043"/>
+      <w:bookmarkStart w:id="41" w:name="_Toc243135952"/>
       <w:r>
         <w:t>9.3 The document vault</w:t>
       </w:r>
@@ -9547,9 +9534,9 @@
       <w:pPr>
         <w:pStyle w:val="Heading2"/>
       </w:pPr>
-      <w:bookmarkStart w:id="42" w:name="_Toc243120044"/>
-      <w:r>
-        <w:t>9.4 Reading the books — Reports and the audit trail</w:t>
+      <w:bookmarkStart w:id="42" w:name="_Toc243135953"/>
+      <w:r>
+        <w:t>9.4 Reading the books — Reports</w:t>
       </w:r>
       <w:bookmarkEnd w:id="42"/>
     </w:p>
@@ -9598,20 +9585,20 @@
           <w:rFonts w:eastAsia="Calibri" w:cs="Calibri"/>
           <w:b/>
         </w:rPr>
-        <w:t>The audit trail:</w:t>
-      </w:r>
-      <w:r>
-        <w:rPr>
-          <w:rFonts w:eastAsia="Calibri" w:cs="Calibri"/>
-        </w:rPr>
-        <w:t xml:space="preserve"> filter by money, people, records or settings, by who did it, by record type, by date and by free text; switch on "unusual only" to read what needs explaining; export exactly the view on screen.</w:t>
+        <w:t>Not the audit trail.</w:t>
+      </w:r>
+      <w:r>
+        <w:rPr>
+          <w:rFonts w:eastAsia="Calibri" w:cs="Calibri"/>
+        </w:rPr>
+        <w:t xml:space="preserve"> It is for the admins only. When an outside auditor needs it, an admin exports the view from the Audit screen and hands over the workbook.</w:t>
       </w:r>
     </w:p>
     <w:p>
       <w:pPr>
         <w:pStyle w:val="Heading2"/>
       </w:pPr>
-      <w:bookmarkStart w:id="43" w:name="_Toc243120045"/>
+      <w:bookmarkStart w:id="43" w:name="_Toc243135954"/>
       <w:r>
         <w:t>9.5 What the secretary cannot do</w:t>
       </w:r>
@@ -9691,7 +9678,7 @@
       <w:pPr>
         <w:pStyle w:val="Heading2"/>
       </w:pPr>
-      <w:bookmarkStart w:id="44" w:name="_Toc243120046"/>
+      <w:bookmarkStart w:id="44" w:name="_Toc243135955"/>
       <w:r>
         <w:t>9.6 A meeting, step by step</w:t>
       </w:r>
@@ -9840,14 +9827,14 @@
           <w:color w:val="5A645E"/>
           <w:sz w:val="19"/>
         </w:rPr>
-        <w:t>Behind the screen: /api/reports (read and export), /api/audit (read and export), /api/documents (read, and write), /api/minutes (read, and write). Nothing under /api/members, /api/ledger, /api/fines, /api/settings, /api/backup or /api/jobs.</w:t>
+        <w:t>Behind the screen: /api/reports (read and export), /api/documents (read, and write), /api/minutes (read, and write). Nothing under /api/members, /api/ledger, /api/fines, /api/audit, /api/settings, /api/backup or /api/jobs.</w:t>
       </w:r>
     </w:p>
     <w:p>
       <w:pPr>
         <w:pStyle w:val="Heading1"/>
       </w:pPr>
-      <w:bookmarkStart w:id="45" w:name="_Toc243120047"/>
+      <w:bookmarkStart w:id="45" w:name="_Toc243135956"/>
       <w:r>
         <w:t>10. The disciplinary officer — fines, and nothing else</w:t>
       </w:r>
@@ -9870,7 +9857,7 @@
       <w:pPr>
         <w:pStyle w:val="Heading2"/>
       </w:pPr>
-      <w:bookmarkStart w:id="46" w:name="_Toc243120048"/>
+      <w:bookmarkStart w:id="46" w:name="_Toc243135957"/>
       <w:r>
         <w:t>10.1 The account</w:t>
       </w:r>
@@ -9916,7 +9903,7 @@
       <w:pPr>
         <w:pStyle w:val="Heading2"/>
       </w:pPr>
-      <w:bookmarkStart w:id="47" w:name="_Toc243120049"/>
+      <w:bookmarkStart w:id="47" w:name="_Toc243135958"/>
       <w:r>
         <w:t>10.2 The screen</w:t>
       </w:r>
@@ -10016,7 +10003,7 @@
       <w:pPr>
         <w:pStyle w:val="Heading2"/>
       </w:pPr>
-      <w:bookmarkStart w:id="48" w:name="_Toc243120050"/>
+      <w:bookmarkStart w:id="48" w:name="_Toc243135959"/>
       <w:r>
         <w:t>10.3 What the officer gets out</w:t>
       </w:r>
@@ -10098,7 +10085,7 @@
       <w:pPr>
         <w:pStyle w:val="Heading2"/>
       </w:pPr>
-      <w:bookmarkStart w:id="49" w:name="_Toc243120051"/>
+      <w:bookmarkStart w:id="49" w:name="_Toc243135960"/>
       <w:r>
         <w:t>10.4 What the disciplinary officer cannot do</w:t>
       </w:r>
@@ -10192,7 +10179,7 @@
       <w:pPr>
         <w:pStyle w:val="Heading2"/>
       </w:pPr>
-      <w:bookmarkStart w:id="50" w:name="_Toc243120052"/>
+      <w:bookmarkStart w:id="50" w:name="_Toc243135961"/>
       <w:r>
         <w:t>10.5 Issuing a fine, step by step</w:t>
       </w:r>
@@ -10285,7 +10272,7 @@
       <w:pPr>
         <w:pStyle w:val="Heading1"/>
       </w:pPr>
-      <w:bookmarkStart w:id="51" w:name="_Toc243120053"/>
+      <w:bookmarkStart w:id="51" w:name="_Toc243135962"/>
       <w:r>
         <w:t>11. Who can manage whom</w:t>
       </w:r>
@@ -11000,7 +10987,7 @@
       <w:pPr>
         <w:pStyle w:val="Heading1"/>
       </w:pPr>
-      <w:bookmarkStart w:id="52" w:name="_Toc243120054"/>
+      <w:bookmarkStart w:id="52" w:name="_Toc243135963"/>
       <w:r>
         <w:t>12. The access matrix</w:t>
       </w:r>
@@ -12626,7 +12613,7 @@
                 <w:rFonts w:eastAsia="Calibri" w:cs="Calibri"/>
                 <w:sz w:val="15"/>
               </w:rPr>
-              <w:t>Read + export</w:t>
+              <w:t>No</w:t>
             </w:r>
           </w:p>
         </w:tc>
@@ -12771,7 +12758,7 @@
                 <w:rFonts w:eastAsia="Calibri" w:cs="Calibri"/>
                 <w:sz w:val="15"/>
               </w:rPr>
-              <w:t>Read + export</w:t>
+              <w:t>No</w:t>
             </w:r>
           </w:p>
         </w:tc>
@@ -14364,7 +14351,7 @@
       <w:pPr>
         <w:pStyle w:val="Heading1"/>
       </w:pPr>
-      <w:bookmarkStart w:id="53" w:name="_Toc243120055"/>
+      <w:bookmarkStart w:id="53" w:name="_Toc243135964"/>
       <w:r>
         <w:t>13. Common tasks, step by step</w:t>
       </w:r>
@@ -15384,7 +15371,7 @@
                 <w:rFonts w:eastAsia="Calibri" w:cs="Calibri"/>
                 <w:sz w:val="17"/>
               </w:rPr>
-              <w:t>Super admin, admin, treasurer, secretary</w:t>
+              <w:t>Super admin, admin</w:t>
             </w:r>
           </w:p>
         </w:tc>
@@ -16250,7 +16237,7 @@
       <w:pPr>
         <w:pStyle w:val="Heading1"/>
       </w:pPr>
-      <w:bookmarkStart w:id="54" w:name="_Toc243120056"/>
+      <w:bookmarkStart w:id="54" w:name="_Toc243135965"/>
       <w:r>
         <w:t>14. The money rules every user shares</w:t>
       </w:r>
@@ -16430,7 +16417,7 @@
       <w:pPr>
         <w:pStyle w:val="Heading1"/>
       </w:pPr>
-      <w:bookmarkStart w:id="55" w:name="_Toc243120057"/>
+      <w:bookmarkStart w:id="55" w:name="_Toc243135966"/>
       <w:r>
         <w:t>15. Security, privacy and the audit trail</w:t>
       </w:r>
@@ -16440,7 +16427,7 @@
       <w:pPr>
         <w:pStyle w:val="Heading2"/>
       </w:pPr>
-      <w:bookmarkStart w:id="56" w:name="_Toc243120058"/>
+      <w:bookmarkStart w:id="56" w:name="_Toc243135967"/>
       <w:r>
         <w:t>15.1 What is public and what is not</w:t>
       </w:r>
@@ -16522,7 +16509,7 @@
       <w:pPr>
         <w:pStyle w:val="Heading2"/>
       </w:pPr>
-      <w:bookmarkStart w:id="57" w:name="_Toc243120059"/>
+      <w:bookmarkStart w:id="57" w:name="_Toc243135968"/>
       <w:r>
         <w:t>15.2 The defences that matter in daily use</w:t>
       </w:r>
@@ -16640,7 +16627,7 @@
       <w:pPr>
         <w:pStyle w:val="Heading2"/>
       </w:pPr>
-      <w:bookmarkStart w:id="58" w:name="_Toc243120060"/>
+      <w:bookmarkStart w:id="58" w:name="_Toc243135969"/>
       <w:r>
         <w:t>15.3 The audit trail — what it holds, and who reads it</w:t>
       </w:r>
@@ -16733,7 +16720,7 @@
         <w:rPr>
           <w:rFonts w:eastAsia="Calibri" w:cs="Calibri"/>
         </w:rPr>
-        <w:t xml:space="preserve"> the super admin, the admin, the treasurer and the secretary — the roles that have to explain a figure or verify one. The disciplinary officer has no access.</w:t>
+        <w:t xml:space="preserve"> the super admin and the admin only — the people who answer for the office. The treasurer and the secretary, whose own work it records, do not read it (the API answers 403 and the menu has no Audit entry), and neither does the disciplinary officer.</w:t>
       </w:r>
     </w:p>
     <w:p>
@@ -16794,7 +16781,7 @@
       <w:pPr>
         <w:pStyle w:val="Heading2"/>
       </w:pPr>
-      <w:bookmarkStart w:id="59" w:name="_Toc243120061"/>
+      <w:bookmarkStart w:id="59" w:name="_Toc243135970"/>
       <w:r>
         <w:t>15.4 Backups</w:t>
       </w:r>
@@ -16894,7 +16881,7 @@
       <w:pPr>
         <w:pStyle w:val="Heading1"/>
       </w:pPr>
-      <w:bookmarkStart w:id="60" w:name="_Toc243120062"/>
+      <w:bookmarkStart w:id="60" w:name="_Toc243135971"/>
       <w:r>
         <w:t>16. What only one person can do — and why that matters</w:t>
       </w:r>
@@ -17521,7 +17508,7 @@
       <w:pPr>
         <w:pStyle w:val="Heading1"/>
       </w:pPr>
-      <w:bookmarkStart w:id="61" w:name="_Toc243120063"/>
+      <w:bookmarkStart w:id="61" w:name="_Toc243135972"/>
       <w:r>
         <w:t>Annex A — every screen, and who may open it</w:t>
       </w:r>
@@ -18944,7 +18931,7 @@
                 <w:rFonts w:eastAsia="Calibri" w:cs="Calibri"/>
                 <w:sz w:val="16"/>
               </w:rPr>
-              <w:t>Super admin, admin, treasurer, secretary</w:t>
+              <w:t>Super admin, admin</w:t>
             </w:r>
           </w:p>
         </w:tc>
@@ -19050,7 +19037,7 @@
       <w:pPr>
         <w:pStyle w:val="Heading1"/>
       </w:pPr>
-      <w:bookmarkStart w:id="62" w:name="_Toc243120064"/>
+      <w:bookmarkStart w:id="62" w:name="_Toc243135973"/>
       <w:r>
         <w:t>Annex B — the API, by role</w:t>
       </w:r>
@@ -19822,7 +19809,7 @@
                 <w:rFonts w:eastAsia="Calibri" w:cs="Calibri"/>
                 <w:sz w:val="16"/>
               </w:rPr>
-              <w:t>super_admin, admin, treasurer, secretary</w:t>
+              <w:t>super_admin, admin</w:t>
             </w:r>
           </w:p>
         </w:tc>
@@ -20237,7 +20224,7 @@
       <w:pPr>
         <w:pStyle w:val="Heading1"/>
       </w:pPr>
-      <w:bookmarkStart w:id="63" w:name="_Toc243120065"/>
+      <w:bookmarkStart w:id="63" w:name="_Toc243135974"/>
       <w:r>
         <w:t>Annex C — the words this system uses</w:t>
       </w:r>
@@ -21026,7 +21013,7 @@
       <w:pPr>
         <w:pStyle w:val="Heading1"/>
       </w:pPr>
-      <w:bookmarkStart w:id="64" w:name="_Toc243120066"/>
+      <w:bookmarkStart w:id="64" w:name="_Toc243135975"/>
       <w:r>
         <w:t>Annex D — what was tightened on 22 September 2026</w:t>
       </w:r>
@@ -21213,7 +21200,7 @@
       <w:pPr>
         <w:pStyle w:val="Heading1"/>
       </w:pPr>
-      <w:bookmarkStart w:id="65" w:name="_Toc243120067"/>
+      <w:bookmarkStart w:id="65" w:name="_Toc243135976"/>
       <w:r>
         <w:t>Annex D2 — what was added in October 2026</w:t>
       </w:r>
@@ -21351,6 +21338,24 @@
           <w:rFonts w:eastAsia="Calibri" w:cs="Calibri"/>
         </w:rPr>
         <w:t xml:space="preserve"> (section 6.5): accounts used before sign-in tracking began no longer read "never signed in".</w:t>
+      </w:r>
+    </w:p>
+    <w:p>
+      <w:pPr>
+        <w:pStyle w:val="ListBullet"/>
+      </w:pPr>
+      <w:r>
+        <w:rPr>
+          <w:rFonts w:eastAsia="Calibri" w:cs="Calibri"/>
+          <w:b/>
+        </w:rPr>
+        <w:t>The audit trail is for the admins only</w:t>
+      </w:r>
+      <w:r>
+        <w:rPr>
+          <w:rFonts w:eastAsia="Calibri" w:cs="Calibri"/>
+        </w:rPr>
+        <w:t xml:space="preserve"> (section 15.3). The treasurer and the secretary used to read it; the group withdrew that. The menu entry is gone for both and the API refuses them.</w:t>
       </w:r>
     </w:p>
     <w:p>
@@ -21372,7 +21377,7 @@
       <w:pPr>
         <w:pStyle w:val="Heading1"/>
       </w:pPr>
-      <w:bookmarkStart w:id="66" w:name="_Toc243120068"/>
+      <w:bookmarkStart w:id="66" w:name="_Toc243135977"/>
       <w:r>
         <w:t>Annex E — keeping this true</w:t>
       </w:r>
@@ -21841,31 +21846,31 @@
       </w:rPr>
     </w:lvl>
   </w:abstractNum>
-  <w:num w:numId="1" w16cid:durableId="1319386887">
+  <w:num w:numId="1" w16cid:durableId="1081414794">
     <w:abstractNumId w:val="8"/>
   </w:num>
-  <w:num w:numId="2" w16cid:durableId="747922835">
+  <w:num w:numId="2" w16cid:durableId="1162160267">
     <w:abstractNumId w:val="6"/>
   </w:num>
-  <w:num w:numId="3" w16cid:durableId="1876699854">
+  <w:num w:numId="3" w16cid:durableId="318507751">
     <w:abstractNumId w:val="5"/>
   </w:num>
-  <w:num w:numId="4" w16cid:durableId="203951977">
+  <w:num w:numId="4" w16cid:durableId="1584491817">
     <w:abstractNumId w:val="4"/>
   </w:num>
-  <w:num w:numId="5" w16cid:durableId="32966274">
+  <w:num w:numId="5" w16cid:durableId="1719161836">
     <w:abstractNumId w:val="7"/>
   </w:num>
-  <w:num w:numId="6" w16cid:durableId="1688554206">
+  <w:num w:numId="6" w16cid:durableId="2086603402">
     <w:abstractNumId w:val="3"/>
   </w:num>
-  <w:num w:numId="7" w16cid:durableId="1204438677">
+  <w:num w:numId="7" w16cid:durableId="379331415">
     <w:abstractNumId w:val="2"/>
   </w:num>
-  <w:num w:numId="8" w16cid:durableId="1846044601">
+  <w:num w:numId="8" w16cid:durableId="194463211">
     <w:abstractNumId w:val="1"/>
   </w:num>
-  <w:num w:numId="9" w16cid:durableId="2076856007">
+  <w:num w:numId="9" w16cid:durableId="908920826">
     <w:abstractNumId w:val="0"/>
   </w:num>
 </w:numbering>
@@ -33260,7 +33265,7 @@
     <w:autoRedefine/>
     <w:uiPriority w:val="39"/>
     <w:unhideWhenUsed/>
-    <w:rsid w:val="002B5437"/>
+    <w:rsid w:val="000B71F3"/>
     <w:pPr>
       <w:spacing w:after="100"/>
     </w:pPr>
@@ -33272,7 +33277,7 @@
     <w:autoRedefine/>
     <w:uiPriority w:val="39"/>
     <w:unhideWhenUsed/>
-    <w:rsid w:val="002B5437"/>
+    <w:rsid w:val="000B71F3"/>
     <w:pPr>
       <w:spacing w:after="100"/>
       <w:ind w:left="210"/>
@@ -33283,7 +33288,7 @@
     <w:basedOn w:val="DefaultParagraphFont"/>
     <w:uiPriority w:val="99"/>
     <w:unhideWhenUsed/>
-    <w:rsid w:val="002B5437"/>
+    <w:rsid w:val="000B71F3"/>
     <w:rPr>
       <w:color w:val="0000FF" w:themeColor="hyperlink"/>
       <w:u w:val="single"/>

</xml_diff>